<commit_message>
DAP QB Week 10 Ans FIx
</commit_message>
<xml_diff>
--- a/DAP - Data Analysis using Python/DAP_QB_ANS/DAP_QB_Week_10_Ans.docx
+++ b/DAP - Data Analysis using Python/DAP_QB_ANS/DAP_QB_Week_10_Ans.docx
@@ -2079,8 +2079,6 @@
                     <w:pStyle w:val="TableParagraph"/>
                     <w:rPr>
                       <w:rFonts w:asciiTheme="minorHAnsi" w:hAnsiTheme="minorHAnsi" w:cstheme="minorHAnsi"/>
-                      <w:b/>
-                      <w:bCs/>
                       <w:sz w:val="28"/>
                       <w:szCs w:val="28"/>
                       <w:lang w:val="en-IN"/>
@@ -2089,8 +2087,6 @@
                   <w:r>
                     <w:rPr>
                       <w:rFonts w:asciiTheme="minorHAnsi" w:hAnsiTheme="minorHAnsi" w:cstheme="minorHAnsi"/>
-                      <w:b/>
-                      <w:bCs/>
                       <w:sz w:val="28"/>
                       <w:szCs w:val="28"/>
                       <w:lang w:val="en-IN"/>
@@ -4246,8 +4242,6 @@
                     <w:jc w:val="center"/>
                     <w:rPr>
                       <w:rFonts w:asciiTheme="minorHAnsi" w:eastAsia="Times New Roman" w:hAnsiTheme="minorHAnsi" w:cstheme="minorHAnsi"/>
-                      <w:b/>
-                      <w:bCs/>
                       <w:sz w:val="28"/>
                       <w:szCs w:val="28"/>
                       <w:lang w:val="en-IN" w:eastAsia="en-IN"/>
@@ -4256,8 +4250,6 @@
                   <w:r>
                     <w:rPr>
                       <w:rFonts w:asciiTheme="minorHAnsi" w:eastAsia="Times New Roman" w:hAnsiTheme="minorHAnsi" w:cstheme="minorHAnsi"/>
-                      <w:b/>
-                      <w:bCs/>
                       <w:sz w:val="28"/>
                       <w:szCs w:val="28"/>
                       <w:lang w:val="en-IN" w:eastAsia="en-IN"/>
@@ -10256,7 +10248,7 @@
                 <w:szCs w:val="28"/>
                 <w:lang w:val="en-IN"/>
               </w:rPr>
-              <w:t xml:space="preserve"> = </w:t>
+              <w:t>= </w:t>
             </w:r>
             <w:r>
               <w:rPr>
@@ -10415,71 +10407,34 @@
                 <w:szCs w:val="28"/>
                 <w:lang w:val="en-IN"/>
               </w:rPr>
-              <w:lastRenderedPageBreak/>
-              <w:t>=4+3=7</w:t>
-            </w:r>
-            <w:r>
-              <w:rPr>
-                <w:rFonts w:ascii="Cambria Math" w:hAnsi="Cambria Math" w:cs="Cambria Math"/>
-                <w:sz w:val="28"/>
-                <w:szCs w:val="28"/>
-                <w:lang w:val="en-IN"/>
-              </w:rPr>
-              <w:t>∣</w:t>
-            </w:r>
-            <w:r>
-              <w:rPr>
-                <w:rFonts w:asciiTheme="minorHAnsi" w:hAnsiTheme="minorHAnsi" w:cstheme="minorHAnsi"/>
-                <w:sz w:val="28"/>
-                <w:szCs w:val="28"/>
-                <w:lang w:val="en-IN"/>
-              </w:rPr>
-              <w:t>(−2−2)</w:t>
-            </w:r>
-            <w:r>
-              <w:rPr>
-                <w:rFonts w:ascii="Cambria Math" w:hAnsi="Cambria Math" w:cs="Cambria Math"/>
-                <w:sz w:val="28"/>
-                <w:szCs w:val="28"/>
-                <w:lang w:val="en-IN"/>
-              </w:rPr>
-              <w:t>∣</w:t>
-            </w:r>
-            <w:r>
-              <w:rPr>
-                <w:rFonts w:asciiTheme="minorHAnsi" w:hAnsiTheme="minorHAnsi" w:cstheme="minorHAnsi"/>
-                <w:sz w:val="28"/>
-                <w:szCs w:val="28"/>
-                <w:lang w:val="en-IN"/>
-              </w:rPr>
-              <w:t>+</w:t>
-            </w:r>
-            <w:r>
-              <w:rPr>
-                <w:rFonts w:ascii="Cambria Math" w:hAnsi="Cambria Math" w:cs="Cambria Math"/>
-                <w:sz w:val="28"/>
-                <w:szCs w:val="28"/>
-                <w:lang w:val="en-IN"/>
-              </w:rPr>
-              <w:t>∣</w:t>
-            </w:r>
-            <w:r>
-              <w:rPr>
-                <w:rFonts w:asciiTheme="minorHAnsi" w:hAnsiTheme="minorHAnsi" w:cstheme="minorHAnsi"/>
-                <w:sz w:val="28"/>
-                <w:szCs w:val="28"/>
-                <w:lang w:val="en-IN"/>
-              </w:rPr>
-              <w:t>2−(−1)</w:t>
-            </w:r>
-            <w:r>
-              <w:rPr>
-                <w:rFonts w:ascii="Cambria Math" w:hAnsi="Cambria Math" w:cs="Cambria Math"/>
-                <w:sz w:val="28"/>
-                <w:szCs w:val="28"/>
-                <w:lang w:val="en-IN"/>
-              </w:rPr>
-              <w:t>∣</w:t>
+              <w:t>=</w:t>
+            </w:r>
+            <w:r>
+              <w:rPr>
+                <w:rFonts w:asciiTheme="minorHAnsi" w:hAnsiTheme="minorHAnsi" w:cstheme="minorHAnsi"/>
+                <w:sz w:val="28"/>
+                <w:szCs w:val="28"/>
+                <w:lang w:val="en-IN"/>
+              </w:rPr>
+              <w:t xml:space="preserve"> </w:t>
+            </w:r>
+            <w:r>
+              <w:rPr>
+                <w:rFonts w:asciiTheme="minorHAnsi" w:hAnsiTheme="minorHAnsi" w:cstheme="minorHAnsi"/>
+                <w:sz w:val="28"/>
+                <w:szCs w:val="28"/>
+                <w:lang w:val="en-IN"/>
+              </w:rPr>
+              <w:t>4+3</w:t>
+            </w:r>
+            <w:r>
+              <w:rPr>
+                <w:rFonts w:asciiTheme="minorHAnsi" w:hAnsiTheme="minorHAnsi" w:cstheme="minorHAnsi"/>
+                <w:sz w:val="28"/>
+                <w:szCs w:val="28"/>
+                <w:lang w:val="en-IN"/>
+              </w:rPr>
+              <w:t xml:space="preserve"> </w:t>
             </w:r>
           </w:p>
           <w:p>
@@ -10503,7 +10458,7 @@
                 <w:szCs w:val="28"/>
                 <w:lang w:val="en-IN"/>
               </w:rPr>
-              <w:t>=4+3=7</w:t>
+              <w:t>=7</w:t>
             </w:r>
           </w:p>
           <w:p>
@@ -10536,47 +10491,6 @@
               </w:rPr>
               <w:t>Therefore, the Euclidean distance between points (2, -1) and (-2, 2) is 5 units, and the Manhattan distance between the same points is 7 units.</w:t>
             </w:r>
-          </w:p>
-        </w:tc>
-      </w:tr>
-      <w:tr>
-        <w:trPr>
-          <w:trHeight w:val="20"/>
-        </w:trPr>
-        <w:tc>
-          <w:tcPr>
-            <w:tcW w:w="993" w:type="dxa"/>
-          </w:tcPr>
-          <w:p>
-            <w:pPr>
-              <w:pStyle w:val="TableParagraph"/>
-              <w:ind w:left="1"/>
-              <w:jc w:val="center"/>
-              <w:rPr>
-                <w:rFonts w:asciiTheme="minorHAnsi" w:hAnsiTheme="minorHAnsi" w:cstheme="minorHAnsi"/>
-                <w:b/>
-                <w:bCs/>
-                <w:color w:val="FF0000"/>
-                <w:sz w:val="28"/>
-                <w:szCs w:val="28"/>
-              </w:rPr>
-            </w:pPr>
-          </w:p>
-        </w:tc>
-        <w:tc>
-          <w:tcPr>
-            <w:tcW w:w="10347" w:type="dxa"/>
-          </w:tcPr>
-          <w:p>
-            <w:pPr>
-              <w:pStyle w:val="TableParagraph"/>
-              <w:rPr>
-                <w:rFonts w:asciiTheme="minorHAnsi" w:hAnsiTheme="minorHAnsi" w:cstheme="minorHAnsi"/>
-                <w:sz w:val="28"/>
-                <w:szCs w:val="28"/>
-                <w:lang w:val="en-IN"/>
-              </w:rPr>
-            </w:pPr>
           </w:p>
         </w:tc>
       </w:tr>
@@ -10590,7 +10504,7 @@
       </w:pPr>
     </w:p>
     <w:sectPr>
-      <w:pgSz w:w="11913" w:h="13041"/>
+      <w:pgSz w:w="11913" w:h="15593"/>
       <w:pgMar w:top="0" w:right="1480" w:bottom="0" w:left="697" w:header="720" w:footer="720" w:gutter="0"/>
       <w:cols w:space="720"/>
     </w:sectPr>
@@ -13805,6 +13719,7 @@
   <w:style w:type="character" w:default="1" w:styleId="DefaultParagraphFont">
     <w:name w:val="Default Paragraph Font"/>
     <w:uiPriority w:val="1"/>
+    <w:semiHidden/>
     <w:unhideWhenUsed/>
   </w:style>
   <w:style w:type="table" w:default="1" w:styleId="TableNormal">

</xml_diff>